<commit_message>
[docs]: update hardware wiring document
</commit_message>
<xml_diff>
--- a/docs/智能燃气监测与自动防护系统_硬件设计与接线说明.docx
+++ b/docs/智能燃气监测与自动防护系统_硬件设计与接线说明.docx
@@ -209,7 +209,7 @@
                 <w:b w:val="0"/>
                 <w:sz w:val="19"/>
               </w:rPr>
-              <w:t>MQ-4 + MQ-7 + MQ-8，三路模拟量 ADC 采集</w:t>
+              <w:t>MQ-4 + MQ-6 + MQ-7，三路模拟量 ADC 采集</w:t>
             </w:r>
           </w:p>
         </w:tc>
@@ -258,7 +258,7 @@
                 <w:b w:val="0"/>
                 <w:sz w:val="19"/>
               </w:rPr>
-              <w:t>SSD1306 OLED（I2C1）+ AT24C02（I2C2）</w:t>
+              <w:t>SSD1306 OLED（I2C1）+ AT24C64（I2C2）</w:t>
             </w:r>
           </w:p>
         </w:tc>
@@ -405,7 +405,7 @@
                 <w:b w:val="0"/>
                 <w:sz w:val="19"/>
               </w:rPr>
-              <w:t>4 个 KEY：模式、阈值+、阈值-、安全确认</w:t>
+              <w:t>5 个 KEY：模式、阈值+、阈值-、安全确认</w:t>
             </w:r>
           </w:p>
         </w:tc>
@@ -528,7 +528,7 @@
     </w:p>
     <w:p>
       <w:r>
-        <w:t>系统对三类气体进行独立检测，通过 STM32 ADC 获取三路模拟信号，实时显示检测值并与各自阈值比较。当任一路进入危险状态时，系统进行声光报警，并通过继电器模拟关闭燃气阀。报警解除后阀门不自动恢复，必须在环境恢复安全后按下 KEY4 进行人工确认。阈值和历史报警信息保存到 AT24C02，可通过 OLED、PC 串口或蓝牙进行显示/查询。</w:t>
+        <w:t>系统对三类气体进行独立检测，通过 STM32 ADC 获取三路模拟信号，实时显示检测值并与各自阈值比较。当任一路进入危险状态时，系统进行声光报警，并通过继电器模拟关闭燃气阀。报警解除后阀门不自动恢复，必须在环境恢复安全后按下 KEY4 进行人工确认。阈值和历史报警信息保存到 AT24C64，可通过 OLED、PC 串口或蓝牙进行显示/查询。</w:t>
       </w:r>
     </w:p>
     <w:p>
@@ -555,7 +555,7 @@
           <w:b w:val="0"/>
           <w:sz w:val="17"/>
         </w:rPr>
-        <w:t>MQ-7 ─┼─&gt; ADC ─&gt; STM32F103C8T6 ─┬─&gt; OLED 实时显示</w:t>
+        <w:t>MQ-6 ─┼─&gt; ADC ─&gt; STM32F103C8T6 ─┬─&gt; OLED 实时显示</w:t>
       </w:r>
       <w:r>
         <w:br/>
@@ -566,7 +566,7 @@
           <w:b w:val="0"/>
           <w:sz w:val="17"/>
         </w:rPr>
-        <w:t>MQ-8 ─┘                          ├─&gt; 绿/黄/红 LED</w:t>
+        <w:t>MQ-7 ─┘                          ├─&gt; 绿/黄/红 LED</w:t>
       </w:r>
       <w:r>
         <w:br/>
@@ -610,7 +610,7 @@
           <w:b w:val="0"/>
           <w:sz w:val="17"/>
         </w:rPr>
-        <w:t xml:space="preserve">                                 ├─&gt; AT24C02 历史/参数存储</w:t>
+        <w:t xml:space="preserve">                                 ├─&gt; AT24C64 历史/参数存储</w:t>
       </w:r>
       <w:r>
         <w:br/>
@@ -1056,7 +1056,7 @@
                 <w:b w:val="0"/>
                 <w:sz w:val="17"/>
               </w:rPr>
-              <w:t>MQ-7 模块</w:t>
+              <w:t>MQ-6 模块</w:t>
             </w:r>
           </w:p>
         </w:tc>
@@ -1149,7 +1149,7 @@
                 <w:b w:val="0"/>
                 <w:sz w:val="17"/>
               </w:rPr>
-              <w:t>MQ-8 模块</w:t>
+              <w:t>MQ-7 模块</w:t>
             </w:r>
           </w:p>
         </w:tc>
@@ -1335,7 +1335,7 @@
                 <w:b w:val="0"/>
                 <w:sz w:val="17"/>
               </w:rPr>
-              <w:t>AT24C02 EEPROM 模块</w:t>
+              <w:t>AT24C64 EEPROM 模块</w:t>
             </w:r>
           </w:p>
         </w:tc>
@@ -2765,7 +2765,7 @@
                 <w:b w:val="0"/>
                 <w:sz w:val="16"/>
               </w:rPr>
-              <w:t>MQ-7 AO</w:t>
+              <w:t>MQ-6 AO</w:t>
             </w:r>
           </w:p>
         </w:tc>
@@ -2880,7 +2880,7 @@
                 <w:b w:val="0"/>
                 <w:sz w:val="16"/>
               </w:rPr>
-              <w:t>MQ-8 AO</w:t>
+              <w:t>MQ-7 AO</w:t>
             </w:r>
           </w:p>
         </w:tc>
@@ -3685,7 +3685,7 @@
                 <w:b w:val="0"/>
                 <w:sz w:val="16"/>
               </w:rPr>
-              <w:t>AT24C02 SCL</w:t>
+              <w:t>AT24C64 SCL</w:t>
             </w:r>
           </w:p>
         </w:tc>
@@ -3800,7 +3800,7 @@
                 <w:b w:val="0"/>
                 <w:sz w:val="16"/>
               </w:rPr>
-              <w:t>AT24C02 SDA</w:t>
+              <w:t>AT24C64 SDA</w:t>
             </w:r>
           </w:p>
         </w:tc>
@@ -5356,7 +5356,7 @@
           <w:b w:val="0"/>
           <w:sz w:val="17"/>
         </w:rPr>
-        <w:t xml:space="preserve">   └─&gt; 5V DC-DC ─┬─&gt; MQ-4 / MQ-7 / MQ-8</w:t>
+        <w:t xml:space="preserve">   └─&gt; 5V DC-DC ─┬─&gt; MQ-4 / MQ-6 / MQ-7</w:t>
       </w:r>
       <w:r>
         <w:br/>
@@ -5410,7 +5410,7 @@
           <w:b w:val="0"/>
           <w:sz w:val="17"/>
         </w:rPr>
-        <w:t>STM32 3.3V ───────&gt; OLED、AT24C02（优先 3.3V 供电）</w:t>
+        <w:t>STM32 3.3V ───────&gt; OLED、AT24C64（优先 3.3V 供电）</w:t>
       </w:r>
       <w:r>
         <w:br/>
@@ -5449,7 +5449,7 @@
           <w:b w:val="0"/>
           <w:sz w:val="21"/>
         </w:rPr>
-        <w:t>OLED/AT24C02 若模块板带 I2C 上拉，优先让其上拉到 3.3V，避免把 SDA/SCL 拉到 5V。</w:t>
+        <w:t>OLED/AT24C64 若模块板带 I2C 上拉，优先让其上拉到 3.3V，避免把 SDA/SCL 拉到 5V。</w:t>
       </w:r>
     </w:p>
     <w:p>
@@ -5757,7 +5757,7 @@
                 <w:b w:val="0"/>
                 <w:sz w:val="19"/>
               </w:rPr>
-              <w:t>MQ-7</w:t>
+              <w:t>MQ-6</w:t>
             </w:r>
           </w:p>
         </w:tc>
@@ -5828,7 +5828,7 @@
                 <w:b w:val="0"/>
                 <w:sz w:val="19"/>
               </w:rPr>
-              <w:t>MQ-8</w:t>
+              <w:t>MQ-7</w:t>
             </w:r>
           </w:p>
         </w:tc>
@@ -6341,7 +6341,7 @@
         <w:pStyle w:val="Heading2"/>
       </w:pPr>
       <w:r>
-        <w:t>4.4 AT24C02：I2C2</w:t>
+        <w:t>4.4 AT24C64：I2C2</w:t>
       </w:r>
     </w:p>
     <w:tbl>
@@ -6384,7 +6384,7 @@
                 <w:b/>
                 <w:sz w:val="19"/>
               </w:rPr>
-              <w:t>AT24C02</w:t>
+              <w:t>AT24C64</w:t>
             </w:r>
           </w:p>
         </w:tc>
@@ -6744,7 +6744,7 @@
           <w:b w:val="0"/>
           <w:sz w:val="21"/>
         </w:rPr>
-        <w:t>常见 AT24C02 基础 7 位地址为 0x50，A0/A1/A2 会影响地址，按模块接法确认。</w:t>
+        <w:t>常见 AT24C64 基础 7 位地址为 0x50，A0/A1/A2 会影响地址，按模块接法确认。</w:t>
       </w:r>
     </w:p>
     <w:p>
@@ -6772,7 +6772,7 @@
           <w:b w:val="0"/>
           <w:sz w:val="21"/>
         </w:rPr>
-        <w:t>OLED 与 AT24C02 使用两组独立 I2C，可分别初始化 hi2c1、hi2c2，软件结构清楚；若使用中断/DMA，硬件上也可并行工作。</w:t>
+        <w:t>OLED 与 AT24C64 使用两组独立 I2C，可分别初始化 hi2c1、hi2c2，软件结构清楚；若使用中断/DMA，硬件上也可并行工作。</w:t>
       </w:r>
     </w:p>
     <w:p>
@@ -7559,7 +7559,7 @@
         <w:pStyle w:val="Heading2"/>
       </w:pPr>
       <w:r>
-        <w:t>4.7 4 个按键</w:t>
+        <w:t>4.7 5 个按键（KEY5 使用 PB5 普通上拉轮询）</w:t>
       </w:r>
     </w:p>
     <w:tbl>
@@ -7755,7 +7755,7 @@
                 <w:b w:val="0"/>
                 <w:sz w:val="17"/>
               </w:rPr>
-              <w:t>模式切换 / 选择 MQ-4、MQ-7、MQ-8 阈值</w:t>
+              <w:t>模式切换 / 选择 MQ-4、MQ-6、MQ-7 阈值</w:t>
             </w:r>
           </w:p>
         </w:tc>
@@ -8078,7 +8078,7 @@
           <w:b w:val="0"/>
           <w:sz w:val="21"/>
         </w:rPr>
-        <w:t>PB12～PB15 均属于 EXTI15_10 中断向量，软件在回调中根据 GPIO_Pin 判断具体按键。</w:t>
+        <w:t>PB12～PB15 以及 PB5 均属于 EXTI15_10 中断向量，软件在回调中根据 GPIO_Pin 判断具体按键。</w:t>
       </w:r>
     </w:p>
     <w:p>
@@ -9616,7 +9616,7 @@
           <w:b w:val="0"/>
           <w:sz w:val="17"/>
         </w:rPr>
-        <w:t>写入 AT24C02 报警记录</w:t>
+        <w:t>写入 AT24C64 报警记录</w:t>
       </w:r>
       <w:r>
         <w:br/>
@@ -9709,7 +9709,7 @@
     </w:p>
     <w:p>
       <w:r>
-        <w:t>阈值设置建议：KEY1 循环选择 MQ-4 → MQ-7 → MQ-8 → 返回实时界面；KEY2/KEY3 修改当前选中气体阈值，修改后延时保存到 EEPROM，避免每按一次按键就立即写 EEPROM。</w:t>
+        <w:t>阈值设置建议：KEY1 循环选择 MQ-4 → MQ-6 → MQ-7 → 返回实时界面；KEY2/KEY3 修改当前选中气体阈值，修改后延时保存到 EEPROM，避免每按一次按键就立即写 EEPROM。</w:t>
       </w:r>
     </w:p>
     <w:p>
@@ -9717,12 +9717,12 @@
         <w:pStyle w:val="Heading1"/>
       </w:pPr>
       <w:r>
-        <w:t>6. AT24C02 数据存储建议</w:t>
+        <w:t>6. AT24C64 数据存储建议</w:t>
       </w:r>
     </w:p>
     <w:p>
       <w:r>
-        <w:t>AT24C02 容量为 2 Kbit（256 字节）。课设数据量很小，可将“系统配置”和“报警记录”分区。下面是一种简单、易实现的布局。</w:t>
+        <w:t>AT24C64 容量为 64 Kbit（8192 字节）。课设数据量很小，可将“系统配置”和“报警记录”分区。下面是一种简单、易实现的布局。</w:t>
       </w:r>
     </w:p>
     <w:tbl>
@@ -10081,7 +10081,7 @@
                 <w:b w:val="0"/>
                 <w:sz w:val="18"/>
               </w:rPr>
-              <w:t>MQ-7 阈值</w:t>
+              <w:t>MQ-6 阈值</w:t>
             </w:r>
           </w:p>
         </w:tc>
@@ -10152,7 +10152,7 @@
                 <w:b w:val="0"/>
                 <w:sz w:val="18"/>
               </w:rPr>
-              <w:t>MQ-8 阈值</w:t>
+              <w:t>MQ-7 阈值</w:t>
             </w:r>
           </w:p>
         </w:tc>
@@ -10599,7 +10599,7 @@
                 <w:b w:val="0"/>
                 <w:sz w:val="18"/>
               </w:rPr>
-              <w:t>MQ-4/MQ-7/MQ-8；建议 Scan + DMA 或定时轮询</w:t>
+              <w:t>MQ-4/MQ-6/MQ-7；建议 Scan + DMA 或定时轮询</w:t>
             </w:r>
           </w:p>
         </w:tc>
@@ -10741,7 +10741,7 @@
                 <w:b w:val="0"/>
                 <w:sz w:val="18"/>
               </w:rPr>
-              <w:t>AT24C02</w:t>
+              <w:t>AT24C64</w:t>
             </w:r>
           </w:p>
         </w:tc>
@@ -11003,7 +11003,7 @@
                 <w:b w:val="0"/>
                 <w:sz w:val="18"/>
               </w:rPr>
-              <w:t>PB12～PB15 Falling Edge + Pull-up</w:t>
+              <w:t>PB12～PB15 以及 PB5 Falling Edge + Pull-up</w:t>
             </w:r>
           </w:p>
         </w:tc>
@@ -11025,7 +11025,7 @@
                 <w:b w:val="0"/>
                 <w:sz w:val="18"/>
               </w:rPr>
-              <w:t>4 个按键</w:t>
+              <w:t>5 个按键</w:t>
             </w:r>
           </w:p>
         </w:tc>
@@ -11126,7 +11126,7 @@
           <w:b w:val="0"/>
           <w:sz w:val="21"/>
         </w:rPr>
-        <w:t>如果 Proteus 中找不到具体 MQ-4/MQ-7/MQ-8 模块模型，可使用 POT（电位器）或可变直流源分别模拟三路 AO 电压，重点验证 ADC、阈值和状态机逻辑。</w:t>
+        <w:t>如果 Proteus 中找不到具体 MQ-4/MQ-6/MQ-7 模块模型，可使用 POT（电位器）或可变直流源分别模拟三路 AO 电压，重点验证 ADC、阈值和状态机逻辑。</w:t>
       </w:r>
     </w:p>
     <w:p>
@@ -11154,7 +11154,7 @@
           <w:b w:val="0"/>
           <w:sz w:val="21"/>
         </w:rPr>
-        <w:t>AT24C02 通常可直接使用 24C02/24LC02 等兼容模型，地址脚 A0/A1/A2 与原理图保持一致。</w:t>
+        <w:t>AT24C64 通常可直接使用 24C02/24LC02 等兼容模型，地址脚 A0/A1/A2 与原理图保持一致。</w:t>
       </w:r>
     </w:p>
     <w:p>
@@ -11348,7 +11348,7 @@
           <w:b w:val="0"/>
           <w:sz w:val="21"/>
         </w:rPr>
-        <w:t>逐个接入 MQ-4、MQ-7、MQ-8，测分压前/后的实际电压，再开启 ADC 采集。</w:t>
+        <w:t>逐个接入 MQ-4、MQ-6、MQ-7，测分压前/后的实际电压，再开启 ADC 采集。</w:t>
       </w:r>
     </w:p>
     <w:p>
@@ -11374,7 +11374,7 @@
           <w:b w:val="0"/>
           <w:sz w:val="21"/>
         </w:rPr>
-        <w:t>接 AT24C02（I2C2），测试单字节/多字节读写和掉电保存。</w:t>
+        <w:t>接 AT24C64（I2C2），测试单字节/多字节读写和掉电保存。</w:t>
       </w:r>
     </w:p>
     <w:p>
@@ -11387,7 +11387,7 @@
           <w:b w:val="0"/>
           <w:sz w:val="21"/>
         </w:rPr>
-        <w:t>接 4 个 KEY，验证 EXTI 和软件消抖。</w:t>
+        <w:t>接 5 个 KEY，验证 EXTI 和软件消抖。</w:t>
       </w:r>
     </w:p>
     <w:p>
@@ -11473,7 +11473,7 @@
           <w:b w:val="0"/>
           <w:sz w:val="21"/>
         </w:rPr>
-        <w:t>☐  MQ-4、MQ-7、MQ-8 可分别设置阈值。</w:t>
+        <w:t>☐  MQ-4、MQ-6、MQ-7 可分别设置阈值。</w:t>
       </w:r>
     </w:p>
     <w:p>
@@ -11486,7 +11486,7 @@
           <w:b w:val="0"/>
           <w:sz w:val="21"/>
         </w:rPr>
-        <w:t>☐  KEY1/KEY2/KEY3 可完成模式切换和阈值加减。</w:t>
+        <w:t>☐  KEY1/KEY2/KEY3/KEY5 可完成页面、设置项和阈值调整。</w:t>
       </w:r>
     </w:p>
     <w:p>
@@ -11525,7 +11525,7 @@
           <w:b w:val="0"/>
           <w:sz w:val="21"/>
         </w:rPr>
-        <w:t>☐  修改阈值后掉电重启仍能从 AT24C02 恢复。</w:t>
+        <w:t>☐  修改阈值后掉电重启仍能从 AT24C64 恢复。</w:t>
       </w:r>
     </w:p>
     <w:p>
@@ -11538,7 +11538,7 @@
           <w:b w:val="0"/>
           <w:sz w:val="21"/>
         </w:rPr>
-        <w:t>☐  报警事件可以写入 AT24C02，并通过 OLED 或 PC 串口查询。</w:t>
+        <w:t>☐  报警事件可以写入 AT24C64，并通过 OLED 或 PC 串口查询。</w:t>
       </w:r>
     </w:p>
     <w:p>
@@ -11612,7 +11612,7 @@
           <w:b w:val="0"/>
           <w:sz w:val="17"/>
         </w:rPr>
-        <w:t>PA1  ← MQ-7 AO（经分压）</w:t>
+        <w:t>PA1  ← MQ-6 AO（经分压）</w:t>
       </w:r>
       <w:r>
         <w:br/>
@@ -11623,7 +11623,7 @@
           <w:b w:val="0"/>
           <w:sz w:val="17"/>
         </w:rPr>
-        <w:t>PA4  ← MQ-8 AO（经分压）</w:t>
+        <w:t>PA4  ← MQ-7 AO（经分压）</w:t>
       </w:r>
       <w:r>
         <w:br/>
@@ -11720,7 +11720,7 @@
           <w:b w:val="0"/>
           <w:sz w:val="17"/>
         </w:rPr>
-        <w:t>PB10 → AT24C02 SCL</w:t>
+        <w:t>PB10 → AT24C64 SCL</w:t>
       </w:r>
       <w:r>
         <w:br/>
@@ -11731,7 +11731,7 @@
           <w:b w:val="0"/>
           <w:sz w:val="17"/>
         </w:rPr>
-        <w:t>PB11 ↔ AT24C02 SDA</w:t>
+        <w:t>PB11 ↔ AT24C64 SDA</w:t>
       </w:r>
       <w:r>
         <w:br/>

</xml_diff>